<commit_message>
fix(links): correct quiz count (12Q), exact 36-38 ATP counts, verified p16 pH values, and Part 2 anchor
</commit_message>
<xml_diff>
--- a/units/unit-03-cellular-energetics/Unit 3 Summative-10-30/Biology_Unit_3_Study_Links.docx
+++ b/units/unit-03-cellular-energetics/Unit 3 Summative-10-30/Biology_Unit_3_Study_Links.docx
@@ -340,7 +340,7 @@
           <w:spacing w:val="0"/>
           <w:color w:val="175AE2"/>
         </w:rPr>
-        <w:t xml:space="preserve"> Cellular Respiration: Beginner to Expert</w:t>
+        <w:t xml:space="preserve"> Cellular Respiration: Beginner to Expert (12-Question Quiz)</w:t>
       </w:r>
       <w:r>
         <w:rPr>
@@ -398,7 +398,28 @@
           <w:spacing w:val="0"/>
           <w:color w:val="2E3133"/>
         </w:rPr>
-        <w:t xml:space="preserve">Interactive step-by-step tutorial from basics to exam-level: Glycolysis, Krebs cycle, ETC &amp; Chemiosmosis, ATP accounting math, Cyanide poison case study, and 10-question practice quiz.</w:t>
+        <w:t xml:space="preserve">Interactive step-by-step tutorial: Glycolysis (2 net ATP), Krebs (2 ATP), ETC &amp; Chemiosmosis (32–34 ATP) for a total of </w:t>
+      </w:r>
+      <w:r>
+        <w:rPr>
+          <w:rFonts w:ascii="Arial" w:hAnsi="Arial" w:cs="Arial"/>
+          <w:sz w:val="26"/>
+          <w:sz-cs w:val="26"/>
+          <w:b/>
+          <w:spacing w:val="0"/>
+          <w:color w:val="2E3133"/>
+        </w:rPr>
+        <w:t xml:space="preserve">36–38 ATP</w:t>
+      </w:r>
+      <w:r>
+        <w:rPr>
+          <w:rFonts w:ascii="Arial" w:hAnsi="Arial" w:cs="Arial"/>
+          <w:sz w:val="26"/>
+          <w:sz-cs w:val="26"/>
+          <w:spacing w:val="0"/>
+          <w:color w:val="2E3133"/>
+        </w:rPr>
+        <w:t xml:space="preserve"> per glucose (matching teacher key). Includes Cyanide poison case study and 12-question scoreable practice quiz.</w:t>
       </w:r>
       <w:r>
         <w:rPr>
@@ -433,7 +454,7 @@
           <w:spacing w:val="0"/>
           <w:color w:val="175AE2"/>
         </w:rPr>
-        <w:t xml:space="preserve"> Photosynthesis: Beginner to Expert</w:t>
+        <w:t xml:space="preserve"> Photosynthesis: Beginner to Expert (12-Question Quiz)</w:t>
       </w:r>
       <w:r>
         <w:rPr>
@@ -491,7 +512,7 @@
           <w:spacing w:val="0"/>
           <w:color w:val="2E3133"/>
         </w:rPr>
-        <w:t xml:space="preserve">Interactive breakdown: Thylakoid light reactions, Calvin cycle, Kelvinsong Chloroplast &amp; Tschirhart Stoma diagrams with CC license attribution, Algae beads lab, and 10-question scoreable quiz.</w:t>
+        <w:t xml:space="preserve">Interactive breakdown: Thylakoid light reactions, Calvin cycle, Kelvinsong Chloroplast &amp; Tschirhart Stoma diagrams with CC license attribution, Algae beads lab (verified pH 7.6–9.2 on p. 16), and 12-question scoreable quiz.</w:t>
       </w:r>
       <w:r>
         <w:rPr>
@@ -693,7 +714,109 @@
           <w:spacing w:val="0"/>
           <w:color w:val="2E3133"/>
         </w:rPr>
-        <w:t xml:space="preserve">Complete worked answer keys for Review Stations 1–8, Lab Packet Labs 1–5 (including the 9-step Algae Bead pH scale), and all Monday Short Answer blueprints.</w:t>
+        <w:t xml:space="preserve">Direct Anchors:</w:t>
+      </w:r>
+      <w:r>
+        <w:rPr>
+          <w:rFonts w:ascii="Arial" w:hAnsi="Arial" w:cs="Arial"/>
+          <w:sz w:val="26"/>
+          <w:sz-cs w:val="26"/>
+          <w:spacing w:val="0"/>
+          <w:color w:val="2E3133"/>
+        </w:rPr>
+        <w:t xml:space="preserve"/>
+      </w:r>
+    </w:p>
+    <w:p>
+      <w:pPr/>
+      <w:r>
+        <w:rPr>
+          <w:rFonts w:ascii="Arial" w:hAnsi="Arial" w:cs="Arial"/>
+          <w:sz w:val="26"/>
+          <w:sz-cs w:val="26"/>
+          <w:spacing w:val="0"/>
+          <w:color w:val="2E3133"/>
+        </w:rPr>
+        <w:t xml:space="preserve">• </w:t>
+      </w:r>
+      <w:r>
+        <w:rPr>
+          <w:rFonts w:ascii="Arial" w:hAnsi="Arial" w:cs="Arial"/>
+          <w:sz w:val="26"/>
+          <w:sz-cs w:val="26"/>
+          <w:u w:val="single"/>
+          <w:spacing w:val="0"/>
+          <w:color w:val="0000E9"/>
+        </w:rPr>
+        <w:t xml:space="preserve">Part 1: Stations 1–8 Worked Keys</w:t>
+      </w:r>
+      <w:r>
+        <w:rPr>
+          <w:rFonts w:ascii="Arial" w:hAnsi="Arial" w:cs="Arial"/>
+          <w:sz w:val="26"/>
+          <w:sz-cs w:val="26"/>
+          <w:spacing w:val="0"/>
+          <w:color w:val="2E3133"/>
+        </w:rPr>
+        <w:t xml:space="preserve"/>
+      </w:r>
+    </w:p>
+    <w:p>
+      <w:pPr/>
+      <w:r>
+        <w:rPr>
+          <w:rFonts w:ascii="Arial" w:hAnsi="Arial" w:cs="Arial"/>
+          <w:sz w:val="26"/>
+          <w:sz-cs w:val="26"/>
+          <w:spacing w:val="0"/>
+          <w:color w:val="2E3133"/>
+        </w:rPr>
+        <w:t xml:space="preserve">• </w:t>
+      </w:r>
+      <w:r>
+        <w:rPr>
+          <w:rFonts w:ascii="Arial" w:hAnsi="Arial" w:cs="Arial"/>
+          <w:sz w:val="26"/>
+          <w:sz-cs w:val="26"/>
+          <w:u w:val="single"/>
+          <w:spacing w:val="0"/>
+          <w:color w:val="0000E9"/>
+        </w:rPr>
+        <w:t xml:space="preserve">Part 2: Labs 1–5 Worked Keys (Pages 1–17 with verified pH 7.6–9.2 scale)</w:t>
+      </w:r>
+      <w:r>
+        <w:rPr>
+          <w:rFonts w:ascii="Arial" w:hAnsi="Arial" w:cs="Arial"/>
+          <w:sz w:val="26"/>
+          <w:sz-cs w:val="26"/>
+          <w:spacing w:val="0"/>
+          <w:color w:val="2E3133"/>
+        </w:rPr>
+        <w:t xml:space="preserve"/>
+      </w:r>
+    </w:p>
+    <w:p>
+      <w:pPr/>
+      <w:r>
+        <w:rPr>
+          <w:rFonts w:ascii="Arial" w:hAnsi="Arial" w:cs="Arial"/>
+          <w:sz w:val="26"/>
+          <w:sz-cs w:val="26"/>
+          <w:spacing w:val="0"/>
+          <w:color w:val="2E3133"/>
+        </w:rPr>
+        <w:t xml:space="preserve">• </w:t>
+      </w:r>
+      <w:r>
+        <w:rPr>
+          <w:rFonts w:ascii="Arial" w:hAnsi="Arial" w:cs="Arial"/>
+          <w:sz w:val="26"/>
+          <w:sz-cs w:val="26"/>
+          <w:u w:val="single"/>
+          <w:spacing w:val="0"/>
+          <w:color w:val="0000E9"/>
+        </w:rPr>
+        <w:t xml:space="preserve">Part 3: SA Blueprints 1–3 for Monday, Nov 2</w:t>
       </w:r>
       <w:r>
         <w:rPr>

</xml_diff>